<commit_message>
Fix class diagram UML notation and expand relationship explanations
- Composition (filled diamond): User◆──*Rating, Book◆──*Rating
  to reflect on_delete=CASCADE semantics
- Dependency (dashed arrow «uses»): BookflixViews→models/services,
  HybridRecommender→NCF/BERTEmbedder (parameter passing, no ownership)
- Realization (dashed + open triangle «IEmbedder»): BERTEmbedder and
  LSAEmbedder share fit/get/build_user_profile contract (duck typing)
- Added legend to diagram (Композиція / Залежність / Реалізація)
- Section 3.2.4: full explanation of why Aggregation and Inheritance
  are absent; composition over inheritance principle noted

https://claude.ai/code/session_01RjhLL54PX7NtYSEsXfuFxu
</commit_message>
<xml_diff>
--- a/diploma_thesis.docx
+++ b/diploma_thesis.docx
@@ -3946,7 +3946,7 @@
           <w:b/>
           <w:sz w:val="28"/>
         </w:rPr>
-        <w:t>3.2.4. Зв'язки між класами</w:t>
+        <w:t>3.2.4. Типи зв'язків між класами</w:t>
       </w:r>
     </w:p>
     <w:p>
@@ -3962,7 +3962,71 @@
           <w:i w:val="0"/>
           <w:sz w:val="28"/>
         </w:rPr>
-        <w:t>Діаграма відображає чотири типи зв'язків: (1) асоціація з множинністю — Rating *→1 Book та Rating *→1 User (зовнішні ключі ORM із каскадним видаленням); (2) залежність «uses» BookflixViews → Book / User / Rating / HybridRecommender / EvaluationModule / SentimentModule (пунктирні стрілки); (3) залежність «uses» HybridRecommender → NCF і HybridRecommender → BERTEmbedder для обчислення відповідних балів у feature_combination_recommend(); (4) зв'язок «fallback» BERTEmbedder → LSAEmbedder — обидва класи реалізують спільний інтерфейс (fit/get/build_user_profile), що забезпечує прозору заміну без змін у HybridRecommender.</w:t>
+        <w:t>На діаграмі (рис. 3.1) використано три типи UML-зв'язків. Агрегацію та успадкування не застосовано — далі пояснено чому.</w:t>
+      </w:r>
+    </w:p>
+    <w:p>
+      <w:pPr>
+        <w:spacing w:line="420" w:lineRule="exact" w:before="0" w:after="0"/>
+        <w:ind w:firstLine="709"/>
+        <w:jc w:val="both"/>
+      </w:pPr>
+      <w:r>
+        <w:rPr>
+          <w:rFonts w:ascii="Times New Roman" w:hAnsi="Times New Roman"/>
+          <w:b w:val="0"/>
+          <w:i w:val="0"/>
+          <w:sz w:val="28"/>
+        </w:rPr>
+        <w:t>Композиція (заповнений ромб ◆ на стороні «цілого»). Зв'язки User ◆──* Rating та Book ◆──* Rating відображають сильну залежність існування: рядок Rating не має сенсу без відповідного User або Book. Параметр on_delete=CASCADE у Django ORM точно відповідає семантиці композиції — при видаленні User або Book усі пов'язані Rating автоматично видаляються. Множинність: 1 (User/Book) до * (Rating).</w:t>
+      </w:r>
+    </w:p>
+    <w:p>
+      <w:pPr>
+        <w:spacing w:line="420" w:lineRule="exact" w:before="0" w:after="0"/>
+        <w:ind w:firstLine="709"/>
+        <w:jc w:val="both"/>
+      </w:pPr>
+      <w:r>
+        <w:rPr>
+          <w:rFonts w:ascii="Times New Roman" w:hAnsi="Times New Roman"/>
+          <w:b w:val="0"/>
+          <w:i w:val="0"/>
+          <w:sz w:val="28"/>
+        </w:rPr>
+        <w:t>Залежність (пунктирна стрілка ---►, стереотип «uses»). Використовується у двох групах зв'язків: (а) BookflixViews → Book, User, Rating — контролер виконує ORM-запити (Book.objects.all(), Rating.objects.filter(…)), але не зберігає посилань на об'єкти між запитами; (б) BookflixViews → HybridRecommender, EvaluationModule, SentimentModule — view-функції викликають методи сервісів як тимчасові залежності; (в) HybridRecommender → NCF та HybridRecommender → BERTEmbedder — функція feature_combination_recommend() отримує ncf_score_fn та embedder як параметри, тобто не зберігає їх між викликами. Залежність (а не агрегація) обрана тому, що жоден сервіс не «володіє» іншим — час їх існування не пов'язаний.</w:t>
+      </w:r>
+    </w:p>
+    <w:p>
+      <w:pPr>
+        <w:spacing w:line="420" w:lineRule="exact" w:before="0" w:after="0"/>
+        <w:ind w:firstLine="709"/>
+        <w:jc w:val="both"/>
+      </w:pPr>
+      <w:r>
+        <w:rPr>
+          <w:rFonts w:ascii="Times New Roman" w:hAnsi="Times New Roman"/>
+          <w:b w:val="0"/>
+          <w:i w:val="0"/>
+          <w:sz w:val="28"/>
+        </w:rPr>
+        <w:t>Реалізація (пунктирна лінія + порожній трикутник ◁, стереотип «IEmbedder»). BERTEmbedder та LSAEmbedder реалізують один неформальний інтерфейс: fit(books_df), get(isbn) та build_user_profile(liked_isbns). У Python відсутня явна декларація інтерфейсу (duck typing), проте в UML це правильно відображається як реалізація спільного контракту. Це дозволяє HybridRecommender прозоро працювати з будь-яким ембедером без змін у власному коді.</w:t>
+      </w:r>
+    </w:p>
+    <w:p>
+      <w:pPr>
+        <w:spacing w:line="420" w:lineRule="exact" w:before="0" w:after="0"/>
+        <w:ind w:firstLine="709"/>
+        <w:jc w:val="both"/>
+      </w:pPr>
+      <w:r>
+        <w:rPr>
+          <w:rFonts w:ascii="Times New Roman" w:hAnsi="Times New Roman"/>
+          <w:b w:val="0"/>
+          <w:i w:val="0"/>
+          <w:sz w:val="28"/>
+        </w:rPr>
+        <w:t>Чому відсутні агрегація та успадкування. Агрегація (порожній ромб) означала б, що «частина» може існувати незалежно від «цілого» (наприклад, BookflixViews «має» HybridRecommender, але HybridRecommender існує окремо). Однак у BOOKFLIX усі ML-сервіси є модулями/функціями без стану — вони не інстанціюються контролером, тому агрегація семантично неточна. Успадкування відсутнє, оскільки жоден клас не наслідує інший — BOOKFLIX дотримується принципу композиції над успадкуванням.</w:t>
       </w:r>
     </w:p>
     <w:p>

</xml_diff>

<commit_message>
Rework class diagram and expand section 3.2 description
- Redesign class diagram: added <<stereotype>> labels, BookflixViews
  controller, proper UML layout (3 columns: models / controller / ML
  services) matching evolution from 2023 coursework
- Classes shown: Book, User, Rating (<<model>>); BookflixViews
  (<<controller>>); NCF, BERTEmbedder, HybridRecommender,
  SentimentModule, EvaluationModule, LSAEmbedder (<<service>>)
- Added 4 sub-sections 3.2.1–3.2.4 describing each class group and
  UML relationships (association, uses, fallback)

https://claude.ai/code/session_01RjhLL54PX7NtYSEsXfuFxu
</commit_message>
<xml_diff>
--- a/diploma_thesis.docx
+++ b/diploma_thesis.docx
@@ -1238,6 +1238,58 @@
           <w:sz w:val="28"/>
         </w:rPr>
         <w:t xml:space="preserve">    3.2. Архітектура програмного комплексу та інтеграція ML-компонентів</w:t>
+      </w:r>
+    </w:p>
+    <w:p>
+      <w:pPr>
+        <w:spacing w:line="420" w:lineRule="exact" w:before="0" w:after="0"/>
+        <w:jc w:val="left"/>
+      </w:pPr>
+      <w:r>
+        <w:rPr>
+          <w:rFonts w:ascii="Times New Roman" w:hAnsi="Times New Roman"/>
+          <w:sz w:val="28"/>
+        </w:rPr>
+        <w:t xml:space="preserve">        3.2.1. Класи рівня даних (&lt;&lt;model&gt;&gt;)</w:t>
+      </w:r>
+    </w:p>
+    <w:p>
+      <w:pPr>
+        <w:spacing w:line="420" w:lineRule="exact" w:before="0" w:after="0"/>
+        <w:jc w:val="left"/>
+      </w:pPr>
+      <w:r>
+        <w:rPr>
+          <w:rFonts w:ascii="Times New Roman" w:hAnsi="Times New Roman"/>
+          <w:sz w:val="28"/>
+        </w:rPr>
+        <w:t xml:space="preserve">        3.2.2. Клас контролера (&lt;&lt;controller&gt;&gt;)</w:t>
+      </w:r>
+    </w:p>
+    <w:p>
+      <w:pPr>
+        <w:spacing w:line="420" w:lineRule="exact" w:before="0" w:after="0"/>
+        <w:jc w:val="left"/>
+      </w:pPr>
+      <w:r>
+        <w:rPr>
+          <w:rFonts w:ascii="Times New Roman" w:hAnsi="Times New Roman"/>
+          <w:sz w:val="28"/>
+        </w:rPr>
+        <w:t xml:space="preserve">        3.2.3. ML-сервіси (&lt;&lt;service&gt;&gt;)</w:t>
+      </w:r>
+    </w:p>
+    <w:p>
+      <w:pPr>
+        <w:spacing w:line="420" w:lineRule="exact" w:before="0" w:after="0"/>
+        <w:jc w:val="left"/>
+      </w:pPr>
+      <w:r>
+        <w:rPr>
+          <w:rFonts w:ascii="Times New Roman" w:hAnsi="Times New Roman"/>
+          <w:sz w:val="28"/>
+        </w:rPr>
+        <w:t xml:space="preserve">        3.2.4. Зв'язки між класами</w:t>
       </w:r>
     </w:p>
     <w:p>
@@ -3515,71 +3567,7 @@
           <w:i w:val="0"/>
           <w:sz w:val="28"/>
         </w:rPr>
-        <w:t>Система BOOKFLIX реалізована за MVT-архітектурою Django з чотирма логічними рівнями:</w:t>
-      </w:r>
-    </w:p>
-    <w:p>
-      <w:pPr>
-        <w:spacing w:line="420" w:lineRule="exact" w:before="0" w:after="0"/>
-        <w:ind w:firstLine="709"/>
-        <w:jc w:val="both"/>
-      </w:pPr>
-      <w:r>
-        <w:rPr>
-          <w:rFonts w:ascii="Times New Roman" w:hAnsi="Times New Roman"/>
-          <w:b w:val="0"/>
-          <w:i w:val="0"/>
-          <w:sz w:val="28"/>
-        </w:rPr>
-        <w:t>Рівень даних (Data Layer): PostgreSQL/SQLite (Django ORM), CSV Book-Crossing + goodbooks-10k, GitHub Releases для великих CSV-файлів (~200 MB).</w:t>
-      </w:r>
-    </w:p>
-    <w:p>
-      <w:pPr>
-        <w:spacing w:line="420" w:lineRule="exact" w:before="0" w:after="0"/>
-        <w:ind w:firstLine="709"/>
-        <w:jc w:val="both"/>
-      </w:pPr>
-      <w:r>
-        <w:rPr>
-          <w:rFonts w:ascii="Times New Roman" w:hAnsi="Times New Roman"/>
-          <w:b w:val="0"/>
-          <w:i w:val="0"/>
-          <w:sz w:val="28"/>
-        </w:rPr>
-        <w:t>ML-рівень (пакет bookflix/ml/): ncf.py (NCF-модель), embeddings.py (BERTEmbedder + LSAEmbedder), hybrid.py (FC + cascade), evaluation.py (метрики), sentiment.py (VADER-корекція).</w:t>
-      </w:r>
-    </w:p>
-    <w:p>
-      <w:pPr>
-        <w:spacing w:line="420" w:lineRule="exact" w:before="0" w:after="0"/>
-        <w:ind w:firstLine="709"/>
-        <w:jc w:val="both"/>
-      </w:pPr>
-      <w:r>
-        <w:rPr>
-          <w:rFonts w:ascii="Times New Roman" w:hAnsi="Times New Roman"/>
-          <w:b w:val="0"/>
-          <w:i w:val="0"/>
-          <w:sz w:val="28"/>
-        </w:rPr>
-        <w:t>Сервісний рівень: recommendation_algorithms.py — уніфікована точка входу, завантаження даних, train_test_split, get_session_recommendations().</w:t>
-      </w:r>
-    </w:p>
-    <w:p>
-      <w:pPr>
-        <w:spacing w:line="420" w:lineRule="exact" w:before="0" w:after="0"/>
-        <w:ind w:firstLine="709"/>
-        <w:jc w:val="both"/>
-      </w:pPr>
-      <w:r>
-        <w:rPr>
-          <w:rFonts w:ascii="Times New Roman" w:hAnsi="Times New Roman"/>
-          <w:b w:val="0"/>
-          <w:i w:val="0"/>
-          <w:sz w:val="28"/>
-        </w:rPr>
-        <w:t>Рівень представлення: 10 view-функцій, REST API (/api/session/rate/, /api/session/clear/, /api/evaluate/, /api/recommendations/&lt;user_id&gt;/), HTML-шаблони з Tailwind CSS.</w:t>
+        <w:t>Система BOOKFLIX реалізована за MVT-архітектурою Django з чотирма логічними рівнями: рівень даних (PostgreSQL/SQLite через Django ORM, CSV-файли Book-Crossing та goodbooks-10k); ML-рівень (пакет bookflix/ml/); сервісний рівень (recommendation_algorithms.py — уніфікована точка входу); рівень представлення (10 view-функцій, REST API, HTML-шаблони Tailwind CSS). Статичну структуру системи відображає UML-діаграма класів (рис. 3.1).</w:t>
       </w:r>
     </w:p>
     <w:p>
@@ -3590,7 +3578,7 @@
       <w:r>
         <w:drawing>
           <wp:inline xmlns:a="http://schemas.openxmlformats.org/drawingml/2006/main" xmlns:pic="http://schemas.openxmlformats.org/drawingml/2006/picture">
-            <wp:extent cx="5040000" cy="3494845"/>
+            <wp:extent cx="5040000" cy="3927008"/>
             <wp:docPr id="2" name="Picture 2"/>
             <wp:cNvGraphicFramePr>
               <a:graphicFrameLocks noChangeAspect="1"/>
@@ -3611,7 +3599,7 @@
                   <pic:spPr>
                     <a:xfrm>
                       <a:off x="0" y="0"/>
-                      <a:ext cx="5040000" cy="3494845"/>
+                      <a:ext cx="5040000" cy="3927008"/>
                     </a:xfrm>
                     <a:prstGeom prst="rect"/>
                   </pic:spPr>
@@ -3633,7 +3621,348 @@
           <w:i/>
           <w:sz w:val="24"/>
         </w:rPr>
-        <w:t>Рисунок 3.1 — UML-діаграма класів: ML-компоненти системи BOOKFLIX</w:t>
+        <w:t>Рисунок 3.1 — UML-діаграма класів системи BOOKFLIX 2025</w:t>
+      </w:r>
+    </w:p>
+    <w:p>
+      <w:pPr>
+        <w:spacing w:line="420" w:lineRule="exact" w:before="0" w:after="0"/>
+        <w:ind w:firstLine="709"/>
+        <w:jc w:val="both"/>
+      </w:pPr>
+      <w:r>
+        <w:rPr>
+          <w:rFonts w:ascii="Times New Roman" w:hAnsi="Times New Roman"/>
+          <w:b w:val="0"/>
+          <w:i w:val="0"/>
+          <w:sz w:val="28"/>
+        </w:rPr>
+        <w:t>Порівняно з курсовою роботою 2023 (де використовувались CollaborativeFilter на базі SVD/KNN, ContentBasedFilter на базі TF-IDF, SentimentAnalyzer на TextBlob та RecommendationEngine як монолітний гібрид) архітектура 2025 повністю перероблена: кожен компонент винесено в окремий спеціалізований клас із чітко визначеним інтерфейсом.</w:t>
+      </w:r>
+    </w:p>
+    <w:p>
+      <w:pPr>
+        <w:spacing w:before="120" w:after="120" w:line="420" w:lineRule="exact"/>
+        <w:ind w:firstLine="709"/>
+        <w:jc w:val="left"/>
+      </w:pPr>
+      <w:r>
+        <w:rPr>
+          <w:rFonts w:ascii="Times New Roman" w:hAnsi="Times New Roman"/>
+          <w:b/>
+          <w:sz w:val="28"/>
+        </w:rPr>
+        <w:t>3.2.1. Класи рівня даних (&lt;&lt;model&gt;&gt;)</w:t>
+      </w:r>
+    </w:p>
+    <w:p>
+      <w:pPr>
+        <w:spacing w:line="420" w:lineRule="exact" w:before="0" w:after="0"/>
+        <w:ind w:firstLine="709"/>
+        <w:jc w:val="both"/>
+      </w:pPr>
+      <w:r>
+        <w:rPr>
+          <w:rFonts w:ascii="Times New Roman" w:hAnsi="Times New Roman"/>
+          <w:b w:val="0"/>
+          <w:i w:val="0"/>
+          <w:sz w:val="28"/>
+        </w:rPr>
+        <w:t>Book — Django-модель каталогу книг. Ключові поля: isbn (CharField, db_index=True), title та author (TextField для сумісності з PostgreSQL без обмеження довжини), year_of_publication (IntegerField), publisher (TextField). У порівнянні з 2023 роком додано поле goodreads_rating (FloatField, null=True) — середній рейтинг Goodreads з набору goodbooks-10k, що використовується при ранжуванні пулу кандидатів.</w:t>
+      </w:r>
+    </w:p>
+    <w:p>
+      <w:pPr>
+        <w:spacing w:line="420" w:lineRule="exact" w:before="0" w:after="0"/>
+        <w:ind w:firstLine="709"/>
+        <w:jc w:val="both"/>
+      </w:pPr>
+      <w:r>
+        <w:rPr>
+          <w:rFonts w:ascii="Times New Roman" w:hAnsi="Times New Roman"/>
+          <w:b w:val="0"/>
+          <w:i w:val="0"/>
+          <w:sz w:val="28"/>
+        </w:rPr>
+        <w:t>User — модель користувача. Первинний ключ user_id (IntegerField, unique=True) відповідає ідентифікатору з датасету Book-Crossing; поля location (TextField) та age (IntegerField, null=True) використовуються для статистики Dashboard.</w:t>
+      </w:r>
+    </w:p>
+    <w:p>
+      <w:pPr>
+        <w:spacing w:line="420" w:lineRule="exact" w:before="0" w:after="0"/>
+        <w:ind w:firstLine="709"/>
+        <w:jc w:val="both"/>
+      </w:pPr>
+      <w:r>
+        <w:rPr>
+          <w:rFonts w:ascii="Times New Roman" w:hAnsi="Times New Roman"/>
+          <w:b w:val="0"/>
+          <w:i w:val="0"/>
+          <w:sz w:val="28"/>
+        </w:rPr>
+        <w:t>Rating — асоціативна таблиця з двома зовнішніми ключами: user (FK → User, on_delete=CASCADE) та book (FK → Book, on_delete=CASCADE, db_index=True). Поле book_rating (IntegerField) зберігає явний рейтинг 1–10 після фільтрації нульових (неявних) взаємодій датасету.</w:t>
+      </w:r>
+    </w:p>
+    <w:p>
+      <w:pPr>
+        <w:spacing w:before="120" w:after="120" w:line="420" w:lineRule="exact"/>
+        <w:ind w:firstLine="709"/>
+        <w:jc w:val="left"/>
+      </w:pPr>
+      <w:r>
+        <w:rPr>
+          <w:rFonts w:ascii="Times New Roman" w:hAnsi="Times New Roman"/>
+          <w:b/>
+          <w:sz w:val="28"/>
+        </w:rPr>
+        <w:t>3.2.2. Клас контролера (&lt;&lt;controller&gt;&gt;)</w:t>
+      </w:r>
+    </w:p>
+    <w:p>
+      <w:pPr>
+        <w:spacing w:line="420" w:lineRule="exact" w:before="0" w:after="0"/>
+        <w:ind w:firstLine="709"/>
+        <w:jc w:val="both"/>
+      </w:pPr>
+      <w:r>
+        <w:rPr>
+          <w:rFonts w:ascii="Times New Roman" w:hAnsi="Times New Roman"/>
+          <w:b w:val="0"/>
+          <w:i w:val="0"/>
+          <w:sz w:val="28"/>
+        </w:rPr>
+        <w:t>BookflixViews — центральний контролер Django-застосунку, що зв'язує всі рівні системи. Відповідно до принципу єдиної відповідальності, view-функції не містять ML-логіки — вони делегують виклики до recommendation_algorithms.py. У порівнянні з курсовою (5 методів) контролер розширено до 10 методів. Основні методи:</w:t>
+      </w:r>
+    </w:p>
+    <w:p>
+      <w:pPr>
+        <w:pStyle w:val="ListBullet"/>
+        <w:spacing w:line="420" w:lineRule="exact" w:before="0" w:after="0"/>
+        <w:ind w:left="709"/>
+        <w:jc w:val="both"/>
+      </w:pPr>
+      <w:r>
+        <w:rPr>
+          <w:rFonts w:ascii="Times New Roman" w:hAnsi="Times New Roman"/>
+          <w:sz w:val="28"/>
+        </w:rPr>
+        <w:t>home() / book_list() / book_detail() — каталог та навігація;</w:t>
+      </w:r>
+    </w:p>
+    <w:p>
+      <w:pPr>
+        <w:pStyle w:val="ListBullet"/>
+        <w:spacing w:line="420" w:lineRule="exact" w:before="0" w:after="0"/>
+        <w:ind w:left="709"/>
+        <w:jc w:val="both"/>
+      </w:pPr>
+      <w:r>
+        <w:rPr>
+          <w:rFonts w:ascii="Times New Roman" w:hAnsi="Times New Roman"/>
+          <w:sz w:val="28"/>
+        </w:rPr>
+        <w:t>taste_view() — форма сесійного оцінювання для cold-start (відсутня у 2023);</w:t>
+      </w:r>
+    </w:p>
+    <w:p>
+      <w:pPr>
+        <w:pStyle w:val="ListBullet"/>
+        <w:spacing w:line="420" w:lineRule="exact" w:before="0" w:after="0"/>
+        <w:ind w:left="709"/>
+        <w:jc w:val="both"/>
+      </w:pPr>
+      <w:r>
+        <w:rPr>
+          <w:rFonts w:ascii="Times New Roman" w:hAnsi="Times New Roman"/>
+          <w:sz w:val="28"/>
+        </w:rPr>
+        <w:t>my_recommendations() — рекомендації через get_session_recommendations();</w:t>
+      </w:r>
+    </w:p>
+    <w:p>
+      <w:pPr>
+        <w:pStyle w:val="ListBullet"/>
+        <w:spacing w:line="420" w:lineRule="exact" w:before="0" w:after="0"/>
+        <w:ind w:left="709"/>
+        <w:jc w:val="both"/>
+      </w:pPr>
+      <w:r>
+        <w:rPr>
+          <w:rFonts w:ascii="Times New Roman" w:hAnsi="Times New Roman"/>
+          <w:sz w:val="28"/>
+        </w:rPr>
+        <w:t>user_recommendations(uid) — персоналізовані рекомендації для зареєстрованих;</w:t>
+      </w:r>
+    </w:p>
+    <w:p>
+      <w:pPr>
+        <w:pStyle w:val="ListBullet"/>
+        <w:spacing w:line="420" w:lineRule="exact" w:before="0" w:after="0"/>
+        <w:ind w:left="709"/>
+        <w:jc w:val="both"/>
+      </w:pPr>
+      <w:r>
+        <w:rPr>
+          <w:rFonts w:ascii="Times New Roman" w:hAnsi="Times New Roman"/>
+          <w:sz w:val="28"/>
+        </w:rPr>
+        <w:t>session_rate() — REST endpoint POST /api/session/rate/ → JsonResponse;</w:t>
+      </w:r>
+    </w:p>
+    <w:p>
+      <w:pPr>
+        <w:pStyle w:val="ListBullet"/>
+        <w:spacing w:line="420" w:lineRule="exact" w:before="0" w:after="0"/>
+        <w:ind w:left="709"/>
+        <w:jc w:val="both"/>
+      </w:pPr>
+      <w:r>
+        <w:rPr>
+          <w:rFonts w:ascii="Times New Roman" w:hAnsi="Times New Roman"/>
+          <w:sz w:val="28"/>
+        </w:rPr>
+        <w:t>evaluate() — REST endpoint /api/evaluate/ (запускає EvaluationModule);</w:t>
+      </w:r>
+    </w:p>
+    <w:p>
+      <w:pPr>
+        <w:pStyle w:val="ListBullet"/>
+        <w:spacing w:line="420" w:lineRule="exact" w:before="0" w:after="0"/>
+        <w:ind w:left="709"/>
+        <w:jc w:val="both"/>
+      </w:pPr>
+      <w:r>
+        <w:rPr>
+          <w:rFonts w:ascii="Times New Roman" w:hAnsi="Times New Roman"/>
+          <w:sz w:val="28"/>
+        </w:rPr>
+        <w:t>dashboard() — агрегована статистика та метрики системи (відсутня у 2023).</w:t>
+      </w:r>
+    </w:p>
+    <w:p>
+      <w:pPr>
+        <w:spacing w:before="120" w:after="120" w:line="420" w:lineRule="exact"/>
+        <w:ind w:firstLine="709"/>
+        <w:jc w:val="left"/>
+      </w:pPr>
+      <w:r>
+        <w:rPr>
+          <w:rFonts w:ascii="Times New Roman" w:hAnsi="Times New Roman"/>
+          <w:b/>
+          <w:sz w:val="28"/>
+        </w:rPr>
+        <w:t>3.2.3. ML-сервіси (&lt;&lt;service&gt;&gt;)</w:t>
+      </w:r>
+    </w:p>
+    <w:p>
+      <w:pPr>
+        <w:spacing w:line="420" w:lineRule="exact" w:before="0" w:after="0"/>
+        <w:ind w:firstLine="709"/>
+        <w:jc w:val="both"/>
+      </w:pPr>
+      <w:r>
+        <w:rPr>
+          <w:rFonts w:ascii="Times New Roman" w:hAnsi="Times New Roman"/>
+          <w:b w:val="0"/>
+          <w:i w:val="0"/>
+          <w:sz w:val="28"/>
+        </w:rPr>
+        <w:t>NCF (bookflix/ml/ncf.py) замінює CollaborativeFilter 2023 року. Успадковує nn.Module (PyTorch). Два шари ембедингів (user_embedding та item_embedding, розмірність 32, padding_idx=0 для cold-start) конкатенуються та подаються на MLP [64→32→16→1] із ReLU і Dropout(0.2). Ключовий новий метод infer_user_embedding() реалізує cold-start: обчислює псевдо-ембединг нового користувача як зважене середнє ембедингів оцінених книг без перенавчання моделі.</w:t>
+      </w:r>
+    </w:p>
+    <w:p>
+      <w:pPr>
+        <w:spacing w:line="420" w:lineRule="exact" w:before="0" w:after="0"/>
+        <w:ind w:firstLine="709"/>
+        <w:jc w:val="both"/>
+      </w:pPr>
+      <w:r>
+        <w:rPr>
+          <w:rFonts w:ascii="Times New Roman" w:hAnsi="Times New Roman"/>
+          <w:b w:val="0"/>
+          <w:i w:val="0"/>
+          <w:sz w:val="28"/>
+        </w:rPr>
+        <w:t>BERTEmbedder (bookflix/ml/embeddings.py) замінює ContentBasedFilter 2023. Використовує SentenceTransformer (all-MiniLM-L6-v2, 384 вим.). Метод fit() кодує всі 238 510 книг батчами (batch_size=64) та зберігає L2-нормалізовані ембединги у ndarray [N×384]. Метод build_user_profile() будує профіль користувача як нормоване середнє ембедингів позитивно оцінених книг. LSAEmbedder (TF-IDF + TruncatedSVD(100)) є запасним варіантом і реалізує той самий інтерфейс fit/get/build_user_profile для прозорої заміни.</w:t>
+      </w:r>
+    </w:p>
+    <w:p>
+      <w:pPr>
+        <w:spacing w:line="420" w:lineRule="exact" w:before="0" w:after="0"/>
+        <w:ind w:firstLine="709"/>
+        <w:jc w:val="both"/>
+      </w:pPr>
+      <w:r>
+        <w:rPr>
+          <w:rFonts w:ascii="Times New Roman" w:hAnsi="Times New Roman"/>
+          <w:b w:val="0"/>
+          <w:i w:val="0"/>
+          <w:sz w:val="28"/>
+        </w:rPr>
+        <w:t>HybridRecommender (bookflix/ml/hybrid.py) замінює RecommendationEngine. Метод feature_combination_recommend() реалізує формулу (2.2): combined = 0.6 × ncf_norm + 0.4 × sem_norm. cascade_recommend() збережено для порівняльного аналізу (розд. 4) — реалізує стару каскадну стратегію CBF → NCF-ранжування. Внутрішній метод _normalise() виконує мін-макс нормалізацію по пулу.</w:t>
+      </w:r>
+    </w:p>
+    <w:p>
+      <w:pPr>
+        <w:spacing w:line="420" w:lineRule="exact" w:before="0" w:after="0"/>
+        <w:ind w:firstLine="709"/>
+        <w:jc w:val="both"/>
+      </w:pPr>
+      <w:r>
+        <w:rPr>
+          <w:rFonts w:ascii="Times New Roman" w:hAnsi="Times New Roman"/>
+          <w:b w:val="0"/>
+          <w:i w:val="0"/>
+          <w:sz w:val="28"/>
+        </w:rPr>
+        <w:t>SentimentModule (bookflix/ml/sentiment.py) замінює SentimentAnalyzer. Замість TextBlob (курсова 2023) застосовується VADER через вищу точність на коротких оцінних текстах. build_book_sentiment_map() агрегує compound-оцінки по ISBN; apply_sentiment_correction() застосовує формулу r̃ = clip(r + 0.5·compound, 1, 10).</w:t>
+      </w:r>
+    </w:p>
+    <w:p>
+      <w:pPr>
+        <w:spacing w:line="420" w:lineRule="exact" w:before="0" w:after="0"/>
+        <w:ind w:firstLine="709"/>
+        <w:jc w:val="both"/>
+      </w:pPr>
+      <w:r>
+        <w:rPr>
+          <w:rFonts w:ascii="Times New Roman" w:hAnsi="Times New Roman"/>
+          <w:b w:val="0"/>
+          <w:i w:val="0"/>
+          <w:sz w:val="28"/>
+        </w:rPr>
+        <w:t>EvaluationModule (bookflix/ml/evaluation.py) — новий клас, відсутній у 2023. Реалізує compute_rmse(), precision_at_k() та ndcg_at_k() (RELEVANCE_THRESHOLD = 7). Виклики доступні через REST API /api/evaluate/ та безпосередньо з тестів.</w:t>
+      </w:r>
+    </w:p>
+    <w:p>
+      <w:pPr>
+        <w:spacing w:before="120" w:after="120" w:line="420" w:lineRule="exact"/>
+        <w:ind w:firstLine="709"/>
+        <w:jc w:val="left"/>
+      </w:pPr>
+      <w:r>
+        <w:rPr>
+          <w:rFonts w:ascii="Times New Roman" w:hAnsi="Times New Roman"/>
+          <w:b/>
+          <w:sz w:val="28"/>
+        </w:rPr>
+        <w:t>3.2.4. Зв'язки між класами</w:t>
+      </w:r>
+    </w:p>
+    <w:p>
+      <w:pPr>
+        <w:spacing w:line="420" w:lineRule="exact" w:before="0" w:after="0"/>
+        <w:ind w:firstLine="709"/>
+        <w:jc w:val="both"/>
+      </w:pPr>
+      <w:r>
+        <w:rPr>
+          <w:rFonts w:ascii="Times New Roman" w:hAnsi="Times New Roman"/>
+          <w:b w:val="0"/>
+          <w:i w:val="0"/>
+          <w:sz w:val="28"/>
+        </w:rPr>
+        <w:t>Діаграма відображає чотири типи зв'язків: (1) асоціація з множинністю — Rating *→1 Book та Rating *→1 User (зовнішні ключі ORM із каскадним видаленням); (2) залежність «uses» BookflixViews → Book / User / Rating / HybridRecommender / EvaluationModule / SentimentModule (пунктирні стрілки); (3) залежність «uses» HybridRecommender → NCF і HybridRecommender → BERTEmbedder для обчислення відповідних балів у feature_combination_recommend(); (4) зв'язок «fallback» BERTEmbedder → LSAEmbedder — обидва класи реалізують спільний інтерфейс (fit/get/build_user_profile), що забезпечує прозору заміну без змін у HybridRecommender.</w:t>
       </w:r>
     </w:p>
     <w:p>
@@ -3648,7 +3977,7 @@
           <w:color w:val="606060"/>
           <w:sz w:val="24"/>
         </w:rPr>
-        <w:t>[РИС. 3.2 — Структура пакету bookflix/ml/ та зв'язки між модулями]</w:t>
+        <w:t>[РИС. 3.2 — Структура пакету bookflix/ml/ та залежності між модулями]</w:t>
       </w:r>
     </w:p>
     <w:p>

</xml_diff>

<commit_message>
Embed UML diagrams into diploma thesis docx
Replaced figure placeholders with actual PNG diagrams generated via matplotlib:
- Fig 2.4: Activity diagram (Feature Combination parallel NCF+BERT flow)
- Fig 3.1: Class diagram (ML components: NCF, BERTEmbedder, HybridRecommender, etc.)
- Fig 3.4: Sequence diagram (персоналізовані рекомендації: Browser→Django→NCF→BERT)
- Fig 3.5: Sequence diagram cold-start (сесійне профілювання та infer_user_embedding)
- Fig 3.6: Use case diagram (actors: Anonymous User, Registered User, Admin)

Document grew from 63KB to 982KB with embedded images.

https://claude.ai/code/session_01RjhLL54PX7NtYSEsXfuFxu
</commit_message>
<xml_diff>
--- a/diploma_thesis.docx
+++ b/diploma_thesis.docx
@@ -3136,17 +3136,56 @@
     </w:p>
     <w:p>
       <w:pPr>
-        <w:spacing w:before="120" w:after="60" w:line="420" w:lineRule="exact"/>
+        <w:spacing w:before="120" w:after="60"/>
         <w:jc w:val="center"/>
       </w:pPr>
       <w:r>
+        <w:drawing>
+          <wp:inline xmlns:a="http://schemas.openxmlformats.org/drawingml/2006/main" xmlns:pic="http://schemas.openxmlformats.org/drawingml/2006/picture">
+            <wp:extent cx="5040000" cy="7990244"/>
+            <wp:docPr id="1" name="Picture 1"/>
+            <wp:cNvGraphicFramePr>
+              <a:graphicFrameLocks noChangeAspect="1"/>
+            </wp:cNvGraphicFramePr>
+            <a:graphic>
+              <a:graphicData uri="http://schemas.openxmlformats.org/drawingml/2006/picture">
+                <pic:pic>
+                  <pic:nvPicPr>
+                    <pic:cNvPr id="0" name="activity.png"/>
+                    <pic:cNvPicPr/>
+                  </pic:nvPicPr>
+                  <pic:blipFill>
+                    <a:blip r:embed="rId9"/>
+                    <a:stretch>
+                      <a:fillRect/>
+                    </a:stretch>
+                  </pic:blipFill>
+                  <pic:spPr>
+                    <a:xfrm>
+                      <a:off x="0" y="0"/>
+                      <a:ext cx="5040000" cy="7990244"/>
+                    </a:xfrm>
+                    <a:prstGeom prst="rect"/>
+                  </pic:spPr>
+                </pic:pic>
+              </a:graphicData>
+            </a:graphic>
+          </wp:inline>
+        </w:drawing>
+      </w:r>
+    </w:p>
+    <w:p>
+      <w:pPr>
+        <w:spacing w:before="0" w:after="120" w:line="420" w:lineRule="exact"/>
+        <w:jc w:val="center"/>
+      </w:pPr>
+      <w:r>
         <w:rPr>
           <w:rFonts w:ascii="Times New Roman" w:hAnsi="Times New Roman"/>
           <w:i/>
-          <w:color w:val="606060"/>
           <w:sz w:val="24"/>
         </w:rPr>
-        <w:t>[РИС. 2.4 — Схема Feature Combination: паралельне обчислення NCF та BERT → зважене об'єднання]</w:t>
+        <w:t>Рисунок 2.4 — Діаграма діяльності: Feature Combination — паралельне обчислення NCF та BERT із зваженим об'єднанням</w:t>
       </w:r>
     </w:p>
     <w:p>
@@ -3545,6 +3584,60 @@
     </w:p>
     <w:p>
       <w:pPr>
+        <w:spacing w:before="120" w:after="60"/>
+        <w:jc w:val="center"/>
+      </w:pPr>
+      <w:r>
+        <w:drawing>
+          <wp:inline xmlns:a="http://schemas.openxmlformats.org/drawingml/2006/main" xmlns:pic="http://schemas.openxmlformats.org/drawingml/2006/picture">
+            <wp:extent cx="5040000" cy="3494845"/>
+            <wp:docPr id="2" name="Picture 2"/>
+            <wp:cNvGraphicFramePr>
+              <a:graphicFrameLocks noChangeAspect="1"/>
+            </wp:cNvGraphicFramePr>
+            <a:graphic>
+              <a:graphicData uri="http://schemas.openxmlformats.org/drawingml/2006/picture">
+                <pic:pic>
+                  <pic:nvPicPr>
+                    <pic:cNvPr id="0" name="classdiagram.png"/>
+                    <pic:cNvPicPr/>
+                  </pic:nvPicPr>
+                  <pic:blipFill>
+                    <a:blip r:embed="rId10"/>
+                    <a:stretch>
+                      <a:fillRect/>
+                    </a:stretch>
+                  </pic:blipFill>
+                  <pic:spPr>
+                    <a:xfrm>
+                      <a:off x="0" y="0"/>
+                      <a:ext cx="5040000" cy="3494845"/>
+                    </a:xfrm>
+                    <a:prstGeom prst="rect"/>
+                  </pic:spPr>
+                </pic:pic>
+              </a:graphicData>
+            </a:graphic>
+          </wp:inline>
+        </w:drawing>
+      </w:r>
+    </w:p>
+    <w:p>
+      <w:pPr>
+        <w:spacing w:before="0" w:after="120" w:line="420" w:lineRule="exact"/>
+        <w:jc w:val="center"/>
+      </w:pPr>
+      <w:r>
+        <w:rPr>
+          <w:rFonts w:ascii="Times New Roman" w:hAnsi="Times New Roman"/>
+          <w:i/>
+          <w:sz w:val="24"/>
+        </w:rPr>
+        <w:t>Рисунок 3.1 — UML-діаграма класів: ML-компоненти системи BOOKFLIX</w:t>
+      </w:r>
+    </w:p>
+    <w:p>
+      <w:pPr>
         <w:spacing w:before="120" w:after="60" w:line="420" w:lineRule="exact"/>
         <w:jc w:val="center"/>
       </w:pPr>
@@ -3555,22 +3648,7 @@
           <w:color w:val="606060"/>
           <w:sz w:val="24"/>
         </w:rPr>
-        <w:t>[РИС. 3.1 — UML-компонентна діаграма архітектури BOOKFLIX]</w:t>
-      </w:r>
-    </w:p>
-    <w:p>
-      <w:pPr>
-        <w:spacing w:before="120" w:after="60" w:line="420" w:lineRule="exact"/>
-        <w:jc w:val="center"/>
-      </w:pPr>
-      <w:r>
-        <w:rPr>
-          <w:rFonts w:ascii="Times New Roman" w:hAnsi="Times New Roman"/>
-          <w:i/>
-          <w:color w:val="606060"/>
-          <w:sz w:val="24"/>
-        </w:rPr>
-        <w:t>[РИС. 3.2 — Діаграма модулів пакету bookflix/ml/]</w:t>
+        <w:t>[РИС. 3.2 — Структура пакету bookflix/ml/ та зв'язки між модулями]</w:t>
       </w:r>
     </w:p>
     <w:p>
@@ -3798,6 +3876,229 @@
     </w:p>
     <w:p>
       <w:pPr>
+        <w:spacing w:before="120" w:after="60"/>
+        <w:jc w:val="center"/>
+      </w:pPr>
+      <w:r>
+        <w:drawing>
+          <wp:inline xmlns:a="http://schemas.openxmlformats.org/drawingml/2006/main" xmlns:pic="http://schemas.openxmlformats.org/drawingml/2006/picture">
+            <wp:extent cx="5040000" cy="3539040"/>
+            <wp:docPr id="3" name="Picture 3"/>
+            <wp:cNvGraphicFramePr>
+              <a:graphicFrameLocks noChangeAspect="1"/>
+            </wp:cNvGraphicFramePr>
+            <a:graphic>
+              <a:graphicData uri="http://schemas.openxmlformats.org/drawingml/2006/picture">
+                <pic:pic>
+                  <pic:nvPicPr>
+                    <pic:cNvPr id="0" name="sequence.png"/>
+                    <pic:cNvPicPr/>
+                  </pic:nvPicPr>
+                  <pic:blipFill>
+                    <a:blip r:embed="rId11"/>
+                    <a:stretch>
+                      <a:fillRect/>
+                    </a:stretch>
+                  </pic:blipFill>
+                  <pic:spPr>
+                    <a:xfrm>
+                      <a:off x="0" y="0"/>
+                      <a:ext cx="5040000" cy="3539040"/>
+                    </a:xfrm>
+                    <a:prstGeom prst="rect"/>
+                  </pic:spPr>
+                </pic:pic>
+              </a:graphicData>
+            </a:graphic>
+          </wp:inline>
+        </w:drawing>
+      </w:r>
+    </w:p>
+    <w:p>
+      <w:pPr>
+        <w:spacing w:before="0" w:after="120" w:line="420" w:lineRule="exact"/>
+        <w:jc w:val="center"/>
+      </w:pPr>
+      <w:r>
+        <w:rPr>
+          <w:rFonts w:ascii="Times New Roman" w:hAnsi="Times New Roman"/>
+          <w:i/>
+          <w:sz w:val="24"/>
+        </w:rPr>
+        <w:t>Рисунок 3.4 — Sequence-діаграма: процес отримання персоналізованих рекомендацій</w:t>
+      </w:r>
+    </w:p>
+    <w:p>
+      <w:pPr>
+        <w:spacing w:before="120" w:after="60"/>
+        <w:jc w:val="center"/>
+      </w:pPr>
+      <w:r>
+        <w:drawing>
+          <wp:inline xmlns:a="http://schemas.openxmlformats.org/drawingml/2006/main" xmlns:pic="http://schemas.openxmlformats.org/drawingml/2006/picture">
+            <wp:extent cx="5040000" cy="3254454"/>
+            <wp:docPr id="4" name="Picture 4"/>
+            <wp:cNvGraphicFramePr>
+              <a:graphicFrameLocks noChangeAspect="1"/>
+            </wp:cNvGraphicFramePr>
+            <a:graphic>
+              <a:graphicData uri="http://schemas.openxmlformats.org/drawingml/2006/picture">
+                <pic:pic>
+                  <pic:nvPicPr>
+                    <pic:cNvPr id="0" name="sequence_coldstart.png"/>
+                    <pic:cNvPicPr/>
+                  </pic:nvPicPr>
+                  <pic:blipFill>
+                    <a:blip r:embed="rId12"/>
+                    <a:stretch>
+                      <a:fillRect/>
+                    </a:stretch>
+                  </pic:blipFill>
+                  <pic:spPr>
+                    <a:xfrm>
+                      <a:off x="0" y="0"/>
+                      <a:ext cx="5040000" cy="3254454"/>
+                    </a:xfrm>
+                    <a:prstGeom prst="rect"/>
+                  </pic:spPr>
+                </pic:pic>
+              </a:graphicData>
+            </a:graphic>
+          </wp:inline>
+        </w:drawing>
+      </w:r>
+    </w:p>
+    <w:p>
+      <w:pPr>
+        <w:spacing w:before="0" w:after="120" w:line="420" w:lineRule="exact"/>
+        <w:jc w:val="center"/>
+      </w:pPr>
+      <w:r>
+        <w:rPr>
+          <w:rFonts w:ascii="Times New Roman" w:hAnsi="Times New Roman"/>
+          <w:i/>
+          <w:sz w:val="24"/>
+        </w:rPr>
+        <w:t>Рисунок 3.5 — Sequence-діаграма: сесійне профілювання та cold-start</w:t>
+      </w:r>
+    </w:p>
+    <w:p>
+      <w:pPr>
+        <w:spacing w:before="120" w:after="120" w:line="420" w:lineRule="exact"/>
+        <w:ind w:firstLine="709"/>
+        <w:jc w:val="left"/>
+      </w:pPr>
+      <w:r>
+        <w:rPr>
+          <w:rFonts w:ascii="Times New Roman" w:hAnsi="Times New Roman"/>
+          <w:b/>
+          <w:sz w:val="28"/>
+        </w:rPr>
+        <w:t>3.5. Розробка інтерфейсу користувача та сценарії використання</w:t>
+      </w:r>
+    </w:p>
+    <w:p>
+      <w:pPr>
+        <w:spacing w:line="420" w:lineRule="exact" w:before="0" w:after="0"/>
+        <w:ind w:firstLine="709"/>
+        <w:jc w:val="both"/>
+      </w:pPr>
+      <w:r>
+        <w:rPr>
+          <w:rFonts w:ascii="Times New Roman" w:hAnsi="Times New Roman"/>
+          <w:b w:val="0"/>
+          <w:i w:val="0"/>
+          <w:sz w:val="28"/>
+        </w:rPr>
+        <w:t>Веб-інтерфейс реалізований на Django-шаблонах з Tailwind CSS. Основні сторінки:</w:t>
+      </w:r>
+    </w:p>
+    <w:p>
+      <w:pPr>
+        <w:spacing w:before="120" w:after="60" w:line="420" w:lineRule="exact"/>
+        <w:jc w:val="left"/>
+      </w:pPr>
+      <w:r>
+        <w:rPr>
+          <w:rFonts w:ascii="Times New Roman" w:hAnsi="Times New Roman"/>
+          <w:b/>
+          <w:sz w:val="28"/>
+        </w:rPr>
+        <w:t>Таблиця 3.2 — Маршрути REST API та view-функції BOOKFLIX</w:t>
+      </w:r>
+    </w:p>
+    <w:p>
+      <w:pPr>
+        <w:spacing w:before="120" w:after="60"/>
+        <w:jc w:val="center"/>
+      </w:pPr>
+      <w:r>
+        <w:drawing>
+          <wp:inline xmlns:a="http://schemas.openxmlformats.org/drawingml/2006/main" xmlns:pic="http://schemas.openxmlformats.org/drawingml/2006/picture">
+            <wp:extent cx="5040000" cy="3606145"/>
+            <wp:docPr id="5" name="Picture 5"/>
+            <wp:cNvGraphicFramePr>
+              <a:graphicFrameLocks noChangeAspect="1"/>
+            </wp:cNvGraphicFramePr>
+            <a:graphic>
+              <a:graphicData uri="http://schemas.openxmlformats.org/drawingml/2006/picture">
+                <pic:pic>
+                  <pic:nvPicPr>
+                    <pic:cNvPr id="0" name="usecase.png"/>
+                    <pic:cNvPicPr/>
+                  </pic:nvPicPr>
+                  <pic:blipFill>
+                    <a:blip r:embed="rId13"/>
+                    <a:stretch>
+                      <a:fillRect/>
+                    </a:stretch>
+                  </pic:blipFill>
+                  <pic:spPr>
+                    <a:xfrm>
+                      <a:off x="0" y="0"/>
+                      <a:ext cx="5040000" cy="3606145"/>
+                    </a:xfrm>
+                    <a:prstGeom prst="rect"/>
+                  </pic:spPr>
+                </pic:pic>
+              </a:graphicData>
+            </a:graphic>
+          </wp:inline>
+        </w:drawing>
+      </w:r>
+    </w:p>
+    <w:p>
+      <w:pPr>
+        <w:spacing w:before="0" w:after="120" w:line="420" w:lineRule="exact"/>
+        <w:jc w:val="center"/>
+      </w:pPr>
+      <w:r>
+        <w:rPr>
+          <w:rFonts w:ascii="Times New Roman" w:hAnsi="Times New Roman"/>
+          <w:i/>
+          <w:sz w:val="24"/>
+        </w:rPr>
+        <w:t>Рисунок 3.6 — UML-діаграма варіантів використання системи BOOKFLIX</w:t>
+      </w:r>
+    </w:p>
+    <w:p>
+      <w:pPr>
+        <w:spacing w:line="420" w:lineRule="exact" w:before="0" w:after="0"/>
+        <w:ind w:firstLine="709"/>
+        <w:jc w:val="both"/>
+      </w:pPr>
+      <w:r>
+        <w:rPr>
+          <w:rFonts w:ascii="Times New Roman" w:hAnsi="Times New Roman"/>
+          <w:b w:val="0"/>
+          <w:i w:val="0"/>
+          <w:sz w:val="28"/>
+        </w:rPr>
+        <w:t>Сценарій «Мій смак» (cold-start): анонімний користувач оцінює 5 книг через POST /api/session/rate/ (рейтинги зберігаються в Django-сесії). При запиті get_session_recommendations() будується інферований ембединг (infer_user_embedding) та викликається feature_combination_recommend.</w:t>
+      </w:r>
+    </w:p>
+    <w:p>
+      <w:pPr>
         <w:spacing w:before="120" w:after="60" w:line="420" w:lineRule="exact"/>
         <w:jc w:val="center"/>
       </w:pPr>
@@ -3808,7 +4109,52 @@
           <w:color w:val="606060"/>
           <w:sz w:val="24"/>
         </w:rPr>
-        <w:t>[РИС. 3.4 — Схема cold-start: сесійний профіль → infer_user_embedding → Feature Combination]</w:t>
+        <w:t>[РИС. 3.7 — Скріншот головної сторінки BOOKFLIX (Desktop view)]</w:t>
+      </w:r>
+    </w:p>
+    <w:p>
+      <w:pPr>
+        <w:spacing w:before="120" w:after="60" w:line="420" w:lineRule="exact"/>
+        <w:jc w:val="center"/>
+      </w:pPr>
+      <w:r>
+        <w:rPr>
+          <w:rFonts w:ascii="Times New Roman" w:hAnsi="Times New Roman"/>
+          <w:i/>
+          <w:color w:val="606060"/>
+          <w:sz w:val="24"/>
+        </w:rPr>
+        <w:t>[РИС. 3.8 — Скріншот сторінки «Мій смак» — форма оцінювання книг]</w:t>
+      </w:r>
+    </w:p>
+    <w:p>
+      <w:pPr>
+        <w:spacing w:before="120" w:after="60" w:line="420" w:lineRule="exact"/>
+        <w:jc w:val="center"/>
+      </w:pPr>
+      <w:r>
+        <w:rPr>
+          <w:rFonts w:ascii="Times New Roman" w:hAnsi="Times New Roman"/>
+          <w:i/>
+          <w:color w:val="606060"/>
+          <w:sz w:val="24"/>
+        </w:rPr>
+        <w:t>[РИС. 3.9 — Скріншот сторінки персоналізованих рекомендацій]</w:t>
+      </w:r>
+    </w:p>
+    <w:p>
+      <w:pPr>
+        <w:spacing w:before="120" w:after="60" w:line="420" w:lineRule="exact"/>
+        <w:jc w:val="center"/>
+      </w:pPr>
+      <w:r>
+        <w:rPr>
+          <w:rFonts w:ascii="Times New Roman" w:hAnsi="Times New Roman"/>
+          <w:i/>
+          <w:color w:val="606060"/>
+          <w:sz w:val="24"/>
+        </w:rPr>
+        <w:t>[РИС. 3.10 — Скріншот Dashboard із агрегованою статистикою]</w:t>
       </w:r>
     </w:p>
     <w:p>
@@ -3823,7 +4169,7 @@
           <w:b/>
           <w:sz w:val="28"/>
         </w:rPr>
-        <w:t>3.5. Розробка інтерфейсу користувача та сценарії використання</w:t>
+        <w:t>3.6. Розгортання системи у хмарному середовищі (Render)</w:t>
       </w:r>
     </w:p>
     <w:p>
@@ -3839,21 +4185,7 @@
           <w:i w:val="0"/>
           <w:sz w:val="28"/>
         </w:rPr>
-        <w:t>Веб-інтерфейс реалізований на Django-шаблонах з Tailwind CSS. Основні сторінки:</w:t>
-      </w:r>
-    </w:p>
-    <w:p>
-      <w:pPr>
-        <w:spacing w:before="120" w:after="60" w:line="420" w:lineRule="exact"/>
-        <w:jc w:val="left"/>
-      </w:pPr>
-      <w:r>
-        <w:rPr>
-          <w:rFonts w:ascii="Times New Roman" w:hAnsi="Times New Roman"/>
-          <w:b/>
-          <w:sz w:val="28"/>
-        </w:rPr>
-        <w:t>Таблиця 3.2 — Маршрути REST API та view-функції BOOKFLIX</w:t>
+        <w:t>Система розгорнута на платформі Render із наступною конфігурацією: gunicorn --workers 2 --timeout 120 (збільшений timeout для ML-операцій); DATABASE_URL автоматично налаштовується Render для PostgreSQL; WhiteNoise для роздачі статичних файлів; GitHub Actions для CI/CD.</w:t>
       </w:r>
     </w:p>
     <w:p>
@@ -3869,7 +4201,7 @@
           <w:i w:val="0"/>
           <w:sz w:val="28"/>
         </w:rPr>
-        <w:t>Сценарій «Мій смак» (cold-start): анонімний користувач оцінює 5 книг через POST /api/session/rate/ (рейтинги зберігаються в Django-сесії). При запиті get_session_recommendations() будується інферований ембединг (infer_user_embedding) та викликається feature_combination_recommend.</w:t>
+        <w:t>Великі CSV-файли (~200 MB) завантажуються з GitHub Releases при першому запуску (_download_if_needed). Цей підхід дозволяє уникнути ліміту розміру репозиторію GitHub (100 MB) та зменшити час deployment.</w:t>
       </w:r>
     </w:p>
     <w:p>
@@ -3884,114 +4216,7 @@
           <w:color w:val="606060"/>
           <w:sz w:val="24"/>
         </w:rPr>
-        <w:t>[РИС. 3.5 — Скріншот головної сторінки BOOKFLIX (Desktop view)]</w:t>
-      </w:r>
-    </w:p>
-    <w:p>
-      <w:pPr>
-        <w:spacing w:before="120" w:after="60" w:line="420" w:lineRule="exact"/>
-        <w:jc w:val="center"/>
-      </w:pPr>
-      <w:r>
-        <w:rPr>
-          <w:rFonts w:ascii="Times New Roman" w:hAnsi="Times New Roman"/>
-          <w:i/>
-          <w:color w:val="606060"/>
-          <w:sz w:val="24"/>
-        </w:rPr>
-        <w:t>[РИС. 3.6 — Скріншот сторінки «Мій смак» — форма оцінювання книг]</w:t>
-      </w:r>
-    </w:p>
-    <w:p>
-      <w:pPr>
-        <w:spacing w:before="120" w:after="60" w:line="420" w:lineRule="exact"/>
-        <w:jc w:val="center"/>
-      </w:pPr>
-      <w:r>
-        <w:rPr>
-          <w:rFonts w:ascii="Times New Roman" w:hAnsi="Times New Roman"/>
-          <w:i/>
-          <w:color w:val="606060"/>
-          <w:sz w:val="24"/>
-        </w:rPr>
-        <w:t>[РИС. 3.7 — Скріншот сторінки персоналізованих рекомендацій]</w:t>
-      </w:r>
-    </w:p>
-    <w:p>
-      <w:pPr>
-        <w:spacing w:before="120" w:after="60" w:line="420" w:lineRule="exact"/>
-        <w:jc w:val="center"/>
-      </w:pPr>
-      <w:r>
-        <w:rPr>
-          <w:rFonts w:ascii="Times New Roman" w:hAnsi="Times New Roman"/>
-          <w:i/>
-          <w:color w:val="606060"/>
-          <w:sz w:val="24"/>
-        </w:rPr>
-        <w:t>[РИС. 3.8 — Скріншот Dashboard із агрегованою статистикою]</w:t>
-      </w:r>
-    </w:p>
-    <w:p>
-      <w:pPr>
-        <w:spacing w:before="120" w:after="120" w:line="420" w:lineRule="exact"/>
-        <w:ind w:firstLine="709"/>
-        <w:jc w:val="left"/>
-      </w:pPr>
-      <w:r>
-        <w:rPr>
-          <w:rFonts w:ascii="Times New Roman" w:hAnsi="Times New Roman"/>
-          <w:b/>
-          <w:sz w:val="28"/>
-        </w:rPr>
-        <w:t>3.6. Розгортання системи у хмарному середовищі (Render)</w:t>
-      </w:r>
-    </w:p>
-    <w:p>
-      <w:pPr>
-        <w:spacing w:line="420" w:lineRule="exact" w:before="0" w:after="0"/>
-        <w:ind w:firstLine="709"/>
-        <w:jc w:val="both"/>
-      </w:pPr>
-      <w:r>
-        <w:rPr>
-          <w:rFonts w:ascii="Times New Roman" w:hAnsi="Times New Roman"/>
-          <w:b w:val="0"/>
-          <w:i w:val="0"/>
-          <w:sz w:val="28"/>
-        </w:rPr>
-        <w:t>Система розгорнута на платформі Render із наступною конфігурацією: gunicorn --workers 2 --timeout 120 (збільшений timeout для ML-операцій); DATABASE_URL автоматично налаштовується Render для PostgreSQL; WhiteNoise для роздачі статичних файлів; GitHub Actions для CI/CD.</w:t>
-      </w:r>
-    </w:p>
-    <w:p>
-      <w:pPr>
-        <w:spacing w:line="420" w:lineRule="exact" w:before="0" w:after="0"/>
-        <w:ind w:firstLine="709"/>
-        <w:jc w:val="both"/>
-      </w:pPr>
-      <w:r>
-        <w:rPr>
-          <w:rFonts w:ascii="Times New Roman" w:hAnsi="Times New Roman"/>
-          <w:b w:val="0"/>
-          <w:i w:val="0"/>
-          <w:sz w:val="28"/>
-        </w:rPr>
-        <w:t>Великі CSV-файли (~200 MB) завантажуються з GitHub Releases при першому запуску (_download_if_needed). Цей підхід дозволяє уникнути ліміту розміру репозиторію GitHub (100 MB) та зменшити час deployment.</w:t>
-      </w:r>
-    </w:p>
-    <w:p>
-      <w:pPr>
-        <w:spacing w:before="120" w:after="60" w:line="420" w:lineRule="exact"/>
-        <w:jc w:val="center"/>
-      </w:pPr>
-      <w:r>
-        <w:rPr>
-          <w:rFonts w:ascii="Times New Roman" w:hAnsi="Times New Roman"/>
-          <w:i/>
-          <w:color w:val="606060"/>
-          <w:sz w:val="24"/>
-        </w:rPr>
-        <w:t>[РИС. 3.9 — Інфраструктурна схема розгортання на Render]</w:t>
+        <w:t>[РИС. 3.11 — Інфраструктурна схема розгортання на Render]</w:t>
       </w:r>
     </w:p>
     <w:p>

</xml_diff>